<commit_message>
Add the Mahimahi emulator check and the CrisisMMD re-derivation; final title; back to 12 pages
</commit_message>
<xml_diff>
--- a/manuscript/Response_to_Reviewers_Table.docx
+++ b/manuscript/Response_to_Reviewers_Table.docx
@@ -19,7 +19,7 @@
           <w:b/>
           <w:sz w:val="18"/>
         </w:rPr>
-        <w:t>Manuscript: Evidence Budgeting for Edge AI under Degraded Connectivity (ICCA, camera-ready)</w:t>
+        <w:t>Manuscript: EdgeCloud: Evidence Budgeting for Edge AI under Degraded Connectivity: A Validation Study of Adaptivity, Admissibility and Adversarial Metadata on Synthetic and Real Disaster Data (ICCA, camera-ready)</w:t>
       </w:r>
     </w:p>
     <w:p>
@@ -31,7 +31,7 @@
           <w:b w:val="0"/>
           <w:sz w:val="18"/>
         </w:rPr>
-        <w:t>Reviewed version: EdgeCloud_Merged_IEEE.pdf, 17 pages (byte-identical to manuscript/Original_Submission.pdf).   Current version: manuscript/EdgeCloud_ICCA_Revised_IEEEA4.pdf, 12 pages.   Date: 2026-10-08</w:t>
+        <w:t>Reviewed version: EdgeCloud_Merged_IEEE.pdf, 17 pages (byte-identical to manuscript/Original_Submission.pdf).   Current version: manuscript/EdgeCloud_ICCA_Revised_IEEEA4.pdf, 12 pages (emulator check added 2026-10-09).   Date: 2026-10-08</w:t>
       </w:r>
     </w:p>
     <w:p>
@@ -419,16 +419,11 @@
         <w:tc>
           <w:tcPr>
             <w:tcW w:type="dxa" w:w="1361"/>
-            <w:shd w:val="clear" w:color="auto" w:fill="F8CBAD"/>
+            <w:shd w:val="clear" w:color="auto" w:fill="FFF2CC"/>
           </w:tcPr>
           <w:p>
-            <w:r/>
             <w:r>
-              <w:rPr>
-                <w:b/>
-                <w:sz w:val="17"/>
-              </w:rPr>
-              <w:t>NOT FIXED (bounded)</w:t>
+              <w:t>PARTIALLY FIXED (emulator, no hardware)</w:t>
             </w:r>
           </w:p>
         </w:tc>
@@ -437,12 +432,8 @@
             <w:tcW w:type="dxa" w:w="4535"/>
           </w:tcPr>
           <w:p>
-            <w:r/>
             <w:r>
-              <w:rPr>
-                <w:sz w:val="17"/>
-              </w:rPr>
-              <w:t>No edge hardware, radio testbed or emulator was available. The paper claims nothing that would need one and names this as the primary open item. Added instead: packet loss with retransmission and replayed measured LTE capacity traces (Sec. VII), which narrow the link model without claiming to close it.</w:t>
+              <w:t>A real transport was put under the link model: every byte-model payload was sent over TCP through Mahimahi link shells on the three constant links, the five loss rates and the three LTE traces (2,890 transfers in 17 cells, none failed). No edge device, radio or energy measurement was available, so hardware validation itself remains open and Sec. XII says so.</w:t>
             </w:r>
           </w:p>
         </w:tc>
@@ -451,12 +442,8 @@
             <w:tcW w:type="dxa" w:w="4819"/>
           </w:tcPr>
           <w:p>
-            <w:r/>
             <w:r>
-              <w:rPr>
-                <w:sz w:val="17"/>
-              </w:rPr>
-              <w:t>Sec. X: “no hardware testbed”. Sec. XII names it as the primary open item. The optional emulator run (item F) needs Mahimahi link shells, not installed on this machine.</w:t>
+              <w:t>Sec. VII “Emulator check”: byte term of (3) confirmed (raw record 14.05 s against 13.35 s modelled at 256 kbps); fixed overhead one RTT short (+0.20 to 0.24 s at a 180 ms RTT); slow start and loss recovery not modelled. Log: results/emulator/transfers.csv; scripts/emulator/.</w:t>
             </w:r>
           </w:p>
         </w:tc>
@@ -836,7 +823,7 @@
               <w:rPr>
                 <w:sz w:val="17"/>
               </w:rPr>
-              <w:t>The humanitarian label, defined by the dataset’s annotators, was run (restricted to its three most frequent categories because the machinery is fixed at three). The result weakens the paper’s headline and is reported. The published-baseline reproduction cannot run, and the reason was established at source on 2026-10-08: no published multimodal baseline exists for the damage task.</w:t>
+              <w:t>The humanitarian label, defined by the dataset’s annotators, was run (restricted to its three most frequent categories because the machinery is fixed at three). The result weakens the paper’s headline and is reported. The published-baseline reproduction cannot run; the reason was established at source on 2026-10-08: no published multimodal baseline exists for the damage task.</w:t>
             </w:r>
           </w:p>
         </w:tc>
@@ -851,6 +838,9 @@
                 <w:sz w:val="17"/>
               </w:rPr>
               <w:t>Sec. VIII-F: 11 of 21 and 3 of 7 rather than 15 of 21 and 7 of 7. Reference [5] (Ofli et al. 2020) excludes the damage task — “damage severity was applied only on images, we do not consider this task” — verified from the paper. Official split obtained and inspected (3,526 records, 2,468/529/529); image files absent. Sec. X states this.</w:t>
+            </w:r>
+            <w:r>
+              <w:t xml:space="preserve"> Update 2026-10-09: the full archive with images (CrisisMMD_v2.0.tar.gz) was obtained and the derivation rerun; 19 of 29 record columns byte-identical, image PCA components within 0.13, Table III cells within 1.0 error in 968, all 27 paired signs preserved (results/reproduction_crisismmd/). The published-baseline reproduction still cannot run because no published multimodal baseline exists for the damage task.</w:t>
             </w:r>
           </w:p>
         </w:tc>
@@ -1038,16 +1028,11 @@
         <w:tc>
           <w:tcPr>
             <w:tcW w:type="dxa" w:w="1361"/>
-            <w:shd w:val="clear" w:color="auto" w:fill="FFF2CC"/>
+            <w:shd w:val="clear" w:color="auto" w:fill="E2EFDA"/>
           </w:tcPr>
           <w:p>
-            <w:r/>
             <w:r>
-              <w:rPr>
-                <w:b/>
-                <w:sz w:val="17"/>
-              </w:rPr>
-              <w:t>PARTIALLY FIXED</w:t>
+              <w:t>FIXED</w:t>
             </w:r>
           </w:p>
         </w:tc>
@@ -1056,12 +1041,8 @@
             <w:tcW w:type="dxa" w:w="4535"/>
           </w:tcPr>
           <w:p>
-            <w:r/>
             <w:r>
-              <w:rPr>
-                <w:sz w:val="17"/>
-              </w:rPr>
-              <w:t>Two experiments narrow the link model: packet loss with retransmission, and replayed measured LTE capacity traces. Deployment claims scaled back everywhere. No emulator or testbed was available; stated rather than worked around.</w:t>
+              <w:t>Claims scaled back everywhere and the emulator validation the reviewer offered as the alternative was run: a TCP path through Mahimahi link shells (delay, loss, measured LTE traces). The model’s byte term is confirmed; its fixed overhead, slow start and loss recovery are shown to be missing and are stated as limitations with numbers.</w:t>
             </w:r>
           </w:p>
         </w:tc>
@@ -1070,12 +1051,8 @@
             <w:tcW w:type="dxa" w:w="4819"/>
           </w:tcPr>
           <w:p>
-            <w:r/>
             <w:r>
-              <w:rPr>
-                <w:sz w:val="17"/>
-              </w:rPr>
-              <w:t>Sec. VII: at 10% loss the policy’s tail goes 0.57 → 4.70 s against 0.09 → 0.14 s for the fixed rule; measured traces inflate tail latency up to 8.7×. Sec. X: “no protocol stack … no hardware testbed”. Emulator not available (see R1.4).</w:t>
+              <w:t>Sec. VII: loss at 10% takes the policy’s tail 0.57 → 4.70 s; measured traces inflate tail latency up to 8.7×; emulator: byte term confirmed, additive constant one RTT short, loss term misses both ways on the 10 Mbps link, trace ordering matches the model. Sec. X lists what is still absent: MAC layer, routing, contention, radio, hardware.</w:t>
             </w:r>
           </w:p>
         </w:tc>
@@ -1247,13 +1224,8 @@
             <w:tcW w:type="dxa" w:w="5046"/>
           </w:tcPr>
           <w:p>
-            <w:r/>
             <w:r>
-              <w:rPr>
-                <w:b w:val="0"/>
-                <w:sz w:val="18"/>
-              </w:rPr>
-              <w:t>R1.1, R1.2, R2.1, R2.2, R2.3a, R2.3b, R2.3d, R2.4, R2.6</w:t>
+              <w:t>R1.1, R1.2, R2.1, R2.2, R2.3a, R2.3b, R2.3d, R2.4, R2.5, R2.6</w:t>
             </w:r>
           </w:p>
         </w:tc>
@@ -1262,13 +1234,8 @@
             <w:tcW w:type="dxa" w:w="5046"/>
           </w:tcPr>
           <w:p>
-            <w:r/>
             <w:r>
-              <w:rPr>
-                <w:b w:val="0"/>
-                <w:sz w:val="18"/>
-              </w:rPr>
-              <w:t>9</w:t>
+              <w:t>10</w:t>
             </w:r>
           </w:p>
         </w:tc>
@@ -1294,13 +1261,8 @@
             <w:tcW w:type="dxa" w:w="5046"/>
           </w:tcPr>
           <w:p>
-            <w:r/>
             <w:r>
-              <w:rPr>
-                <w:b w:val="0"/>
-                <w:sz w:val="18"/>
-              </w:rPr>
-              <w:t>R1.3 (deposit is the authors’), R2.3c (baseline does not exist at source; the task itself was run), R2.5 (narrowed, not closed)</w:t>
+              <w:t>R1.3 (deposit is the authors’), R2.3c (baseline does not exist at source; the task itself was run), R1.4 (emulator run; no hardware)</w:t>
             </w:r>
           </w:p>
         </w:tc>
@@ -1309,12 +1271,7 @@
             <w:tcW w:type="dxa" w:w="5046"/>
           </w:tcPr>
           <w:p>
-            <w:r/>
             <w:r>
-              <w:rPr>
-                <w:b w:val="0"/>
-                <w:sz w:val="18"/>
-              </w:rPr>
               <w:t>3</w:t>
             </w:r>
           </w:p>
@@ -1341,13 +1298,8 @@
             <w:tcW w:type="dxa" w:w="5046"/>
           </w:tcPr>
           <w:p>
-            <w:r/>
             <w:r>
-              <w:rPr>
-                <w:b w:val="0"/>
-                <w:sz w:val="18"/>
-              </w:rPr>
-              <w:t>R1.4 (no hardware; claims bounded instead)</w:t>
+              <w:t>none</w:t>
             </w:r>
           </w:p>
         </w:tc>
@@ -1356,13 +1308,8 @@
             <w:tcW w:type="dxa" w:w="5046"/>
           </w:tcPr>
           <w:p>
-            <w:r/>
             <w:r>
-              <w:rPr>
-                <w:b w:val="0"/>
-                <w:sz w:val="18"/>
-              </w:rPr>
-              <w:t>1</w:t>
+              <w:t>0</w:t>
             </w:r>
           </w:p>
         </w:tc>
@@ -1388,7 +1335,7 @@
           <w:b w:val="0"/>
           <w:sz w:val="18"/>
         </w:rPr>
-        <w:t>Two outcomes go against the paper’s own narrative and are reported rather than softened: the threshold rule does not carry over on accuracy (R2.1), and the real-data ranking depends on the label chosen (R2.3c).</w:t>
+        <w:t>Two outcomes go against the paper’s own narrative and are reported rather than softened: the threshold rule does not carry over on accuracy (R2.1); the real-data ranking depends on the label chosen (R2.3c).</w:t>
       </w:r>
     </w:p>
     <w:p>
@@ -1429,6 +1376,14 @@
       </w:pPr>
       <w:r>
         <w:t>Run an institutional iThenticate or Turnitin check — the one review item that cannot be done here.</w:t>
+      </w:r>
+    </w:p>
+    <w:p>
+      <w:pPr>
+        <w:pStyle w:val="ListNumber"/>
+      </w:pPr>
+      <w:r>
+        <w:t>Add scripts/emulator/ and results/emulator/ to the deposited release so the emulator check is reproducible (R1.4, R2.5).</w:t>
       </w:r>
     </w:p>
     <w:sectPr>

</xml_diff>

<commit_message>
Score the established CrisisMMD tasks against the published baselines; R2.3(c) closed
</commit_message>
<xml_diff>
--- a/manuscript/Response_to_Reviewers_Table.docx
+++ b/manuscript/Response_to_Reviewers_Table.docx
@@ -800,16 +800,11 @@
         <w:tc>
           <w:tcPr>
             <w:tcW w:type="dxa" w:w="1361"/>
-            <w:shd w:val="clear" w:color="auto" w:fill="FFF2CC"/>
+            <w:shd w:val="clear" w:color="auto" w:fill="E2EFDA"/>
           </w:tcPr>
           <w:p>
-            <w:r/>
             <w:r>
-              <w:rPr>
-                <w:b/>
-                <w:sz w:val="17"/>
-              </w:rPr>
-              <w:t>PARTIALLY FIXED</w:t>
+              <w:t>FIXED</w:t>
             </w:r>
           </w:p>
         </w:tc>
@@ -818,12 +813,8 @@
             <w:tcW w:type="dxa" w:w="4535"/>
           </w:tcPr>
           <w:p>
-            <w:r/>
             <w:r>
-              <w:rPr>
-                <w:sz w:val="17"/>
-              </w:rPr>
-              <w:t>The humanitarian label, defined by the dataset’s annotators, was run (restricted to its three most frequent categories because the machinery is fixed at three). The result weakens the paper’s headline and is reported. The published-baseline reproduction cannot run; the reason was established at source on 2026-10-08: no published multimodal baseline exists for the damage task.</w:t>
+              <w:t>Two things. The humanitarian label, defined by the dataset’s annotators, was run through the budgeting comparison (restricted to its three most frequent categories because the machinery is fixed at three); the result weakens the headline and is reported. The two established tasks of [5] were scored on the published splits with this paper’s representation against the published baselines, which it exceeds in every cell. Scope: a representation check on their task, not a reproduction of their CNN/VGG16 models; no published baseline exists for the damage task itself.</w:t>
             </w:r>
           </w:p>
         </w:tc>
@@ -832,15 +823,8 @@
             <w:tcW w:type="dxa" w:w="4819"/>
           </w:tcPr>
           <w:p>
-            <w:r/>
             <w:r>
-              <w:rPr>
-                <w:sz w:val="17"/>
-              </w:rPr>
-              <w:t>Sec. VIII-F: 11 of 21 and 3 of 7 rather than 15 of 21 and 7 of 7. Reference [5] (Ofli et al. 2020) excludes the damage task — “damage severity was applied only on images, we do not consider this task” — verified from the paper. Official split obtained and inspected (3,526 records, 2,468/529/529); image files absent. Sec. X states this.</w:t>
-            </w:r>
-            <w:r>
-              <w:t xml:space="preserve"> Update 2026-10-09: the full archive with images (CrisisMMD_v2.0.tar.gz) was obtained and the derivation rerun; 19 of 29 record columns byte-identical, image PCA components within 0.13, Table III cells within 1.0 error in 968, all 27 paired signs preserved (results/reproduction_crisismmd/). The published-baseline reproduction still cannot run because no published multimodal baseline exists for the damage task.</w:t>
+              <w:t>Sec. VIII-F: 11 of 21 and 3 of 7 on the annotators’ label. Established tasks on the published agreed-label splits (test sizes match [5] Table 1): informative 93.7% (text 87.9) vs published 84.4; humanitarian 88.9% (text 83.4) vs 78.4; reduced 8/10-d form 91.5 and 87.7 (results/established_tasks/). [5] full text verified: damage task excluded. Derivation rerun from the full archive: Table III within 1.0 error, all 27 paired signs preserved (results/reproduction_crisismmd/).</w:t>
             </w:r>
           </w:p>
         </w:tc>
@@ -1225,7 +1209,7 @@
           </w:tcPr>
           <w:p>
             <w:r>
-              <w:t>R1.1, R1.2, R2.1, R2.2, R2.3a, R2.3b, R2.3d, R2.4, R2.5, R2.6</w:t>
+              <w:t>R1.1, R1.2, R2.1, R2.2, R2.3a–d, R2.4, R2.5, R2.6</w:t>
             </w:r>
           </w:p>
         </w:tc>
@@ -1235,7 +1219,7 @@
           </w:tcPr>
           <w:p>
             <w:r>
-              <w:t>10</w:t>
+              <w:t>11</w:t>
             </w:r>
           </w:p>
         </w:tc>
@@ -1262,7 +1246,7 @@
           </w:tcPr>
           <w:p>
             <w:r>
-              <w:t>R1.3 (deposit is the authors’), R2.3c (baseline does not exist at source; the task itself was run), R1.4 (emulator run; no hardware)</w:t>
+              <w:t>R1.3 (deposit is the authors’), R1.4 (emulator run; no hardware)</w:t>
             </w:r>
           </w:p>
         </w:tc>
@@ -1272,7 +1256,7 @@
           </w:tcPr>
           <w:p>
             <w:r>
-              <w:t>3</w:t>
+              <w:t>2</w:t>
             </w:r>
           </w:p>
         </w:tc>

</xml_diff>

<commit_message>
Name release v2.6.18 in Section XI; identifier slot proven with a simulated DOI, placeholder kept
</commit_message>
<xml_diff>
--- a/manuscript/Response_to_Reviewers_Table.docx
+++ b/manuscript/Response_to_Reviewers_Table.docx
@@ -362,12 +362,8 @@
             <w:tcW w:type="dxa" w:w="4535"/>
           </w:tcPr>
           <w:p>
-            <w:r/>
             <w:r>
-              <w:rPr>
-                <w:sz w:val="17"/>
-              </w:rPr>
-              <w:t>The red placeholder is gone. Section XI states what a reader can verify today: the repository, the exact version 2.6.17 and that SHA256SUMS digests 113 files; both verified against the archived repository on 2026-10-08. What remains is the deposit itself, which only the authors can perform. No identifier was invented.</w:t>
+              <w:t>The red placeholder is gone. Everything that precedes the deposit is done: release v2.6.18 assembled (v2.6.17 unchanged, digests verified, plus the emulator, re-derivation and established-task materials, CITATION.cff with the five authors, 146 files); the paper's identifier slot is wired and prints; the gate was run once with a simulated identifier and passed 21/21. What remains is the deposit itself, which only the authors can perform; no identifier is invented.</w:t>
             </w:r>
           </w:p>
         </w:tc>
@@ -376,12 +372,8 @@
             <w:tcW w:type="dxa" w:w="4819"/>
           </w:tcPr>
           <w:p>
-            <w:r/>
             <w:r>
-              <w:rPr>
-                <w:sz w:val="17"/>
-              </w:rPr>
-              <w:t>Sec. XI: “at version 2.6.17, the version behind every result reported here, whose SHA256SUMS records a digest for each of its 113 files.” AUTHOR ACTION: deposit the release and insert the identifier into \archivedoi. Also reconcile CITATION.cff, whose author fields still read “[To be completed before deposit]” while the paper names five authors.</w:t>
+              <w:t>Sec. XI: “at version 2.6.18, which carries the 2.6.17 package … unchanged together with the emulator, re-derivation and established-task materials … 146 files. The archived release is &lt;DOI&gt;.” The slot is manuscript/latex/camera_ready.tex and holds a dummy that the gate rejects by design. AUTHOR ACTION: make the repository public, release v2.6.18, mint the DOI, paste it.</w:t>
             </w:r>
           </w:p>
         </w:tc>
@@ -1367,7 +1359,7 @@
         <w:pStyle w:val="ListNumber"/>
       </w:pPr>
       <w:r>
-        <w:t>Add scripts/emulator/ and results/emulator/ to the deposited release so the emulator check is reproducible (R1.4, R2.5).</w:t>
+        <w:t>Release v2.6.18 is assembled by scripts/build_deposit_v2.6.18.sh with the emulator, re-derivation and established-task materials inside; deposit it and paste the DOI into manuscript/latex/camera_ready.tex (R1.3).</w:t>
       </w:r>
     </w:p>
     <w:sectPr>

</xml_diff>

<commit_message>
Add the held-out contribution term and the published-task comparison (v2.7); twenty-seed Fig. 1
</commit_message>
<xml_diff>
--- a/manuscript/Response_to_Reviewers_Table.docx
+++ b/manuscript/Response_to_Reviewers_Table.docx
@@ -681,6 +681,9 @@
               </w:rPr>
               <w:t>Sec. VIII-A: majority-class output is “a class-imbalance effect rather than an artefact of the reduction”; best cell lifts macro-F1 0.219 → 0.452 while accuracy stays below the majority baseline in every rotation.</w:t>
             </w:r>
+            <w:r>
+              <w:t xml:space="preserve"> Sec. VIII-G: a held-out contribution term then removes the cost (447.0 → 386.2 errors with the term on; neutral on synthetic data).</w:t>
+            </w:r>
           </w:p>
         </w:tc>
       </w:tr>
@@ -817,6 +820,9 @@
           <w:p>
             <w:r>
               <w:t>Sec. VIII-F: 11 of 21 and 3 of 7 on the annotators’ label. Established tasks on the published agreed-label splits (test sizes match [5] Table 1): informative 93.7% (text 87.9) vs published 84.4; humanitarian 88.9% (text 83.4) vs 78.4; reduced 8/10-d form 91.5 and 87.7 (results/established_tasks/). [5] full text verified: damage task excluded. Derivation rerun from the full archive: Table III within 1.0 error, all 27 paired signs preserved (results/reproduction_crisismmd/).</w:t>
+            </w:r>
+            <w:r>
+              <w:t xml:space="preserve"> Then (2026-10-09, v2.7): the budgeting comparison itself ran on both published tasks through an N-class copy of the pipeline: transmit-all 91.4% and 86.3% against the published 84.4% and 78.4%, the condition pattern of the damage label repeating (Sec. VIII-G; master Table XIX).</w:t>
             </w:r>
           </w:p>
         </w:tc>

</xml_diff>